<commit_message>
chore(roll-number): update Roll Number from 15 to 16 across all source code, manuals, and deliverables
</commit_message>
<xml_diff>
--- a/DevOps_Lab_Manual_Gayatri_Patil_23102A0016.docx
+++ b/DevOps_Lab_Manual_Gayatri_Patil_23102A0016.docx
@@ -203,7 +203,7 @@
                 <w:color w:val="0EA5E9"/>
                 <w:sz w:val="22"/>
               </w:rPr>
-              <w:t>15</w:t>
+              <w:t>16</w:t>
             </w:r>
           </w:p>
         </w:tc>
@@ -326,7 +326,7 @@
         <w:rPr>
           <w:sz w:val="23"/>
         </w:rPr>
-        <w:t>This is to certify that Miss GAYATRI PATIL, bearing Student ID / PRN 23102A0016 and Roll Number 15, has satisfactorily performed and completed all the prescribed 15 laboratory experiments and DevOps deliverables for the project entitled 'Selenium Testing Pipeline for a Vaccination Reminder Portal (VaxGuard)' as part of the academic curriculum for the course of DevOps Laboratory during the academic year 2026-2027.</w:t>
+        <w:t>This is to certify that Miss GAYATRI PATIL, bearing Student ID / PRN 23102A0016 and Roll Number 16, has satisfactorily performed and completed all the prescribed 15 laboratory experiments and DevOps deliverables for the project entitled 'Selenium Testing Pipeline for a Vaccination Reminder Portal (VaxGuard)' as part of the academic curriculum for the course of DevOps Laboratory during the academic year 2026-2027.</w:t>
       </w:r>
     </w:p>
     <w:tbl>
@@ -3460,7 +3460,7 @@
         <w:br/>
         <w:t xml:space="preserve">  "version": "1.0.0",</w:t>
         <w:br/>
-        <w:t xml:space="preserve">  "author": "Gayatri Patil (PRN: 23102A0016, Roll: 15)",</w:t>
+        <w:t xml:space="preserve">  "author": "Gayatri Patil (PRN: 23102A0016, Roll: 16)",</w:t>
         <w:br/>
         <w:t xml:space="preserve">  "database": "H2 In-Memory (Connected)",</w:t>
         <w:br/>
@@ -6061,7 +6061,7 @@
         <w:br/>
         <w:t xml:space="preserve">  "version": "1.0.0",</w:t>
         <w:br/>
-        <w:t xml:space="preserve">  "author": "Gayatri Patil (PRN: 23102A0016, Roll: 15)",</w:t>
+        <w:t xml:space="preserve">  "author": "Gayatri Patil (PRN: 23102A0016, Roll: 16)",</w:t>
         <w:br/>
         <w:t xml:space="preserve">  "database": "H2 In-Memory (Connected)",</w:t>
         <w:br/>

</xml_diff>